<commit_message>
Add snow scene run screenshot to report
</commit_message>
<xml_diff>
--- a/团队实验报告_雪中即景_完成版.docx
+++ b/团队实验报告_雪中即景_完成版.docx
@@ -4303,6 +4303,82 @@
           <w:szCs w:val="22"/>
         </w:rPr>
         <w:t xml:space="preserve">交互体验：摄像机轨道控制响应流畅；树墩可被实时拖动、旋转和缩放，操作反馈直观，重置功能正常工作。</w:t>
+      </w:r>
+    </w:p>
+    <w:p>
+      <w:pPr>
+        <w:spacing w:after="60" w:before="60"/>
+        <w:ind w:firstLine="440"/>
+      </w:pPr>
+      <w:r>
+        <w:rPr>
+          <w:rFonts w:ascii="SimSun" w:cs="SimSun" w:eastAsia="SimSun" w:hAnsi="SimSun"/>
+          <w:sz w:val="22"/>
+          <w:szCs w:val="22"/>
+        </w:rPr>
+        <w:t xml:space="preserve">2026 年 6 月 12 日重新执行 npm test（调用 build.sh 完成 C++17/OpenGL 项目构建），并启动 build/final 进行运行验证。程序成功加载 Kenney Holiday Kit 的雪人、木屋、积雪树、礼物盒等 OBJ 模型，进入渲染循环后雪花粒子、夜间光照、路灯光晕、木屋窗光与烟雾动画均正常显示。</w:t>
+      </w:r>
+    </w:p>
+    <w:p>
+      <w:pPr>
+        <w:spacing w:after="80" w:before="160"/>
+        <w:jc w:val="center"/>
+      </w:pPr>
+      <w:r>
+        <w:drawing>
+          <wp:inline distT="0" distB="0" distL="0" distR="0">
+            <wp:extent cx="5334000" cy="3238500"/>
+            <wp:effectExtent t="0" r="0" b="0" l="0"/>
+            <wp:docPr id="1" name="" descr="" title=""/>
+            <wp:cNvGraphicFramePr>
+              <a:graphicFrameLocks xmlns:a="http://schemas.openxmlformats.org/drawingml/2006/main" noChangeAspect="1"/>
+            </wp:cNvGraphicFramePr>
+            <a:graphic xmlns:a="http://schemas.openxmlformats.org/drawingml/2006/main">
+              <a:graphicData uri="http://schemas.openxmlformats.org/drawingml/2006/picture">
+                <pic:pic xmlns:pic="http://schemas.openxmlformats.org/drawingml/2006/picture">
+                  <pic:nvPicPr>
+                    <pic:cNvPr id="0" name="" descr=""/>
+                    <pic:cNvPicPr>
+                      <a:picLocks noChangeAspect="1" noChangeArrowheads="1"/>
+                    </pic:cNvPicPr>
+                  </pic:nvPicPr>
+                  <pic:blipFill>
+                    <a:blip r:embed="rId9" cstate="none"/>
+                    <a:srcRect/>
+                    <a:stretch>
+                      <a:fillRect/>
+                    </a:stretch>
+                  </pic:blipFill>
+                  <pic:spPr bwMode="auto">
+                    <a:xfrm>
+                      <a:off x="0" y="0"/>
+                      <a:ext cx="5334000" cy="3238500"/>
+                    </a:xfrm>
+                    <a:prstGeom prst="rect">
+                      <a:avLst/>
+                    </a:prstGeom>
+                  </pic:spPr>
+                </pic:pic>
+              </a:graphicData>
+            </a:graphic>
+          </wp:inline>
+        </w:drawing>
+      </w:r>
+    </w:p>
+    <w:p>
+      <w:pPr>
+        <w:spacing w:after="160" w:before="0"/>
+        <w:jc w:val="center"/>
+      </w:pPr>
+      <w:r>
+        <w:rPr>
+          <w:rFonts w:ascii="SimSun" w:cs="SimSun" w:eastAsia="SimSun" w:hAnsi="SimSun"/>
+          <w:i/>
+          <w:iCs/>
+          <w:sz w:val="20"/>
+          <w:szCs w:val="20"/>
+        </w:rPr>
+        <w:t xml:space="preserve">图 6-1  雪中即景项目运行截图（夜间模式，动态降雪与点光源效果）</w:t>
       </w:r>
     </w:p>
     <w:p>

</xml_diff>